<commit_message>
Roles et rendu mobile : Martin Bitha titulaire Responsable SMSI + Administrateur systeme + Developpeur (PSI-01) ; page Documents ISO empilee proprement sur mobile
Co-Authored-By: Claude Opus 4.8 <noreply@anthropic.com>
</commit_message>
<xml_diff>
--- a/apps/web/public/iso/PSI-01-Politique-securite.docx
+++ b/apps/web/public/iso/PSI-01-Politique-securite.docx
@@ -698,7 +698,7 @@
           </w:tcPr>
           <w:p>
             <w:r>
-              <w:t xml:space="preserve">à définir</w:t>
+              <w:t xml:space="preserve">Martin Bitha</w:t>
             </w:r>
           </w:p>
         </w:tc>
@@ -732,23 +732,23 @@
           </w:tcPr>
           <w:p>
             <w:r>
-              <w:t xml:space="preserve">Gestion des comptes, configuration Supabase/Hostinger</w:t>
-            </w:r>
-          </w:p>
-        </w:tc>
-        <w:tc>
-          <w:tcPr>
-            <w:tcW w:type="dxa" w:w="3120"/>
-            <w:tcMar>
-              <w:top w:type="dxa" w:w="40"/>
-              <w:left w:type="dxa" w:w="90"/>
-              <w:bottom w:type="dxa" w:w="40"/>
-              <w:right w:type="dxa" w:w="90"/>
-            </w:tcMar>
-          </w:tcPr>
-          <w:p>
-            <w:r>
-              <w:t xml:space="preserve">à définir</w:t>
+              <w:t xml:space="preserve">Gestion des comptes, configuration Supabase/Hostinger, exploitation de la plateforme web</w:t>
+            </w:r>
+          </w:p>
+        </w:tc>
+        <w:tc>
+          <w:tcPr>
+            <w:tcW w:type="dxa" w:w="3120"/>
+            <w:tcMar>
+              <w:top w:type="dxa" w:w="40"/>
+              <w:left w:type="dxa" w:w="90"/>
+              <w:bottom w:type="dxa" w:w="40"/>
+              <w:right w:type="dxa" w:w="90"/>
+            </w:tcMar>
+          </w:tcPr>
+          <w:p>
+            <w:r>
+              <w:t xml:space="preserve">Martin Bitha</w:t>
             </w:r>
           </w:p>
         </w:tc>

</xml_diff>

<commit_message>
Documents ISO : redacteur « Martin Bitha, Developpeur Full Stack » (fonction, pas le service) ; idem dans les roles de PSI-01
Co-Authored-By: Claude Fable 5.1 <noreply@anthropic.com>
</commit_message>
<xml_diff>
--- a/apps/web/public/iso/PSI-01-Politique-securite.docx
+++ b/apps/web/public/iso/PSI-01-Politique-securite.docx
@@ -258,7 +258,7 @@
                 <w:sz w:val="20"/>
                 <w:szCs w:val="20"/>
               </w:rPr>
-              <w:t xml:space="preserve">Rédigé par : Martin Bitha, Centre des Solutions Informatiques</w:t>
+              <w:t xml:space="preserve">Rédigé par : Martin Bitha, Développeur Full Stack</w:t>
             </w:r>
           </w:p>
         </w:tc>
@@ -1068,7 +1068,7 @@
                 <w:sz w:val="20"/>
                 <w:szCs w:val="20"/>
               </w:rPr>
-              <w:t xml:space="preserve">Martin Bitha</w:t>
+              <w:t xml:space="preserve">Martin Bitha, Développeur Full Stack</w:t>
             </w:r>
           </w:p>
         </w:tc>

</xml_diff>